<commit_message>
update docx template and docx generation  domain
</commit_message>
<xml_diff>
--- a/public/template/4. Tờ trình phê duyệt KQLCNT TV.docx
+++ b/public/template/4. Tờ trình phê duyệt KQLCNT TV.docx
@@ -1253,7 +1253,44 @@
           <w:bCs/>
           <w:spacing w:val="-8"/>
         </w:rPr>
-        <w:t>: Công ty TNHH Đầu tư Xây dựng HDK;</w:t>
+        <w:t xml:space="preserve">: </w:t>
+      </w:r>
+      <w:r>
+        <w:rPr>
+          <w:rFonts w:hint="default" w:ascii="Times New Roman"/>
+          <w:bCs/>
+          <w:spacing w:val="-8"/>
+          <w:highlight w:val="yellow"/>
+          <w:lang w:val="vi-VN"/>
+        </w:rPr>
+        <w:t>{</w:t>
+      </w:r>
+      <w:r>
+        <w:rPr>
+          <w:rFonts w:hint="default" w:ascii="Times New Roman"/>
+          <w:bCs/>
+          <w:spacing w:val="-8"/>
+          <w:highlight w:val="yellow"/>
+          <w:lang w:val="en-US"/>
+        </w:rPr>
+        <w:t>TV_bid_package.successful_bidder.name</w:t>
+      </w:r>
+      <w:r>
+        <w:rPr>
+          <w:rFonts w:hint="default" w:ascii="Times New Roman"/>
+          <w:bCs/>
+          <w:spacing w:val="-8"/>
+          <w:highlight w:val="yellow"/>
+          <w:lang w:val="vi-VN"/>
+        </w:rPr>
+        <w:t>}</w:t>
+      </w:r>
+      <w:r>
+        <w:rPr>
+          <w:bCs/>
+          <w:spacing w:val="-8"/>
+        </w:rPr>
+        <w:t>;</w:t>
       </w:r>
     </w:p>
     <w:p>
@@ -1274,10 +1311,50 @@
       </w:r>
       <w:r>
         <w:rPr>
+          <w:rFonts w:hint="default" w:ascii="Times New Roman"/>
+          <w:bCs/>
+          <w:spacing w:val="-8"/>
+          <w:highlight w:val="yellow"/>
+          <w:lang w:val="vi-VN"/>
+        </w:rPr>
+        <w:t>{</w:t>
+      </w:r>
+      <w:r>
+        <w:rPr>
+          <w:rFonts w:hint="default" w:ascii="Times New Roman"/>
+          <w:bCs/>
+          <w:spacing w:val="-8"/>
+          <w:highlight w:val="yellow"/>
+          <w:lang w:val="en-US"/>
+        </w:rPr>
+        <w:t>TV_bid_package.successful_bidder.</w:t>
+      </w:r>
+      <w:r>
+        <w:rPr>
+          <w:rFonts w:hint="default"/>
+          <w:bCs/>
+          <w:spacing w:val="-8"/>
+          <w:highlight w:val="yellow"/>
+          <w:lang w:val="en-US"/>
+        </w:rPr>
+        <w:t>address</w:t>
+      </w:r>
+      <w:r>
+        <w:rPr>
+          <w:rFonts w:hint="default" w:ascii="Times New Roman"/>
+          <w:bCs/>
+          <w:spacing w:val="-8"/>
+          <w:highlight w:val="yellow"/>
+          <w:lang w:val="vi-VN"/>
+        </w:rPr>
+        <w:t>}</w:t>
+      </w:r>
+      <w:r>
+        <w:rPr>
           <w:bCs/>
           <w:lang w:val="en-GB"/>
         </w:rPr>
-        <w:t>45/9A đường Tiền Cảng, phường Rạch Dừa, Thành phố Hồ Chí Minh, Việt Nam;</w:t>
+        <w:t>;</w:t>
       </w:r>
     </w:p>
     <w:p>
@@ -1300,13 +1377,60 @@
           <w:bCs/>
           <w:lang w:val="en-GB"/>
         </w:rPr>
-        <w:t>Ông Huỳnh Ngọc Nguyên;</w:t>
+        <w:t xml:space="preserve">Ông </w:t>
+      </w:r>
+      <w:r>
+        <w:rPr>
+          <w:rFonts w:hint="default" w:ascii="Times New Roman"/>
+          <w:bCs/>
+          <w:spacing w:val="-8"/>
+          <w:highlight w:val="yellow"/>
+          <w:lang w:val="vi-VN"/>
+        </w:rPr>
+        <w:t>{</w:t>
+      </w:r>
+      <w:r>
+        <w:rPr>
+          <w:rFonts w:hint="default" w:ascii="Times New Roman"/>
+          <w:bCs/>
+          <w:spacing w:val="-8"/>
+          <w:highlight w:val="yellow"/>
+          <w:lang w:val="en-US"/>
+        </w:rPr>
+        <w:t>TV_bid_package.successful_bidder.</w:t>
+      </w:r>
+      <w:r>
+        <w:rPr>
+          <w:rFonts w:hint="default"/>
+          <w:bCs/>
+          <w:spacing w:val="-8"/>
+          <w:highlight w:val="yellow"/>
+          <w:lang w:val="en-US"/>
+        </w:rPr>
+        <w:t>representative_name</w:t>
+      </w:r>
+      <w:r>
+        <w:rPr>
+          <w:rFonts w:hint="default" w:ascii="Times New Roman"/>
+          <w:bCs/>
+          <w:spacing w:val="-8"/>
+          <w:highlight w:val="yellow"/>
+          <w:lang w:val="vi-VN"/>
+        </w:rPr>
+        <w:t>}</w:t>
       </w:r>
       <w:r>
         <w:rPr>
           <w:bCs/>
           <w:lang w:val="en-GB"/>
         </w:rPr>
+        <w:t>;</w:t>
+      </w:r>
+      <w:r>
+        <w:rPr>
+          <w:bCs/>
+          <w:lang w:val="en-GB"/>
+        </w:rPr>
         <w:tab/>
       </w:r>
       <w:r>
@@ -1320,7 +1444,73 @@
         <w:rPr>
           <w:bCs/>
         </w:rPr>
-        <w:t>Chức vụ: Giám đốc;</w:t>
+        <w:t xml:space="preserve">Chức vụ: </w:t>
+      </w:r>
+      <w:r>
+        <w:rPr>
+          <w:rFonts w:hint="default" w:ascii="Times New Roman"/>
+          <w:bCs/>
+          <w:spacing w:val="-8"/>
+          <w:highlight w:val="yellow"/>
+          <w:lang w:val="vi-VN"/>
+        </w:rPr>
+        <w:t>{</w:t>
+      </w:r>
+      <w:r>
+        <w:rPr>
+          <w:rFonts w:hint="default" w:ascii="Times New Roman"/>
+          <w:bCs/>
+          <w:spacing w:val="-8"/>
+          <w:highlight w:val="yellow"/>
+          <w:lang w:val="en-US"/>
+        </w:rPr>
+        <w:t>TV_bid_package.</w:t>
+      </w:r>
+      <w:r>
+        <w:rPr>
+          <w:rFonts w:hint="default"/>
+          <w:bCs/>
+          <w:spacing w:val="-8"/>
+          <w:highlight w:val="yellow"/>
+          <w:lang w:val="en-US"/>
+        </w:rPr>
+        <w:t>successful</w:t>
+      </w:r>
+      <w:r>
+        <w:rPr>
+          <w:rFonts w:hint="default" w:ascii="Times New Roman"/>
+          <w:bCs/>
+          <w:spacing w:val="-8"/>
+          <w:highlight w:val="yellow"/>
+          <w:lang w:val="en-US"/>
+        </w:rPr>
+        <w:t>_bidder.</w:t>
+      </w:r>
+      <w:r>
+        <w:rPr>
+          <w:rFonts w:hint="default"/>
+          <w:bCs/>
+          <w:spacing w:val="-8"/>
+          <w:highlight w:val="yellow"/>
+          <w:lang w:val="en-US"/>
+        </w:rPr>
+        <w:t>representative_position</w:t>
+      </w:r>
+      <w:r>
+        <w:rPr>
+          <w:rFonts w:hint="default" w:ascii="Times New Roman"/>
+          <w:bCs/>
+          <w:spacing w:val="-8"/>
+          <w:highlight w:val="yellow"/>
+          <w:lang w:val="vi-VN"/>
+        </w:rPr>
+        <w:t>}</w:t>
+      </w:r>
+      <w:r>
+        <w:rPr>
+          <w:bCs/>
+        </w:rPr>
+        <w:t>;</w:t>
       </w:r>
     </w:p>
     <w:p>
@@ -1341,18 +1531,66 @@
       </w:r>
       <w:r>
         <w:rPr>
-          <w:lang w:val="nl-NL"/>
-        </w:rPr>
-        <w:t>02543.</w:t>
-      </w:r>
-      <w:r>
-        <w:rPr>
-          <w:color w:val="000000"/>
-        </w:rPr>
-        <w:t xml:space="preserve"> </w:t>
-      </w:r>
-      <w:r>
-        <w:t>3815486;</w:t>
+          <w:rFonts w:hint="default" w:ascii="Times New Roman"/>
+          <w:bCs/>
+          <w:spacing w:val="-8"/>
+          <w:highlight w:val="yellow"/>
+          <w:lang w:val="vi-VN"/>
+        </w:rPr>
+        <w:t>{</w:t>
+      </w:r>
+      <w:r>
+        <w:rPr>
+          <w:rFonts w:hint="default" w:ascii="Times New Roman"/>
+          <w:bCs/>
+          <w:spacing w:val="-8"/>
+          <w:highlight w:val="yellow"/>
+          <w:lang w:val="en-US"/>
+        </w:rPr>
+        <w:t>TV_bid_package.</w:t>
+      </w:r>
+      <w:r>
+        <w:rPr>
+          <w:rFonts w:hint="default"/>
+          <w:bCs/>
+          <w:spacing w:val="-8"/>
+          <w:highlight w:val="yellow"/>
+          <w:lang w:val="en-US"/>
+        </w:rPr>
+        <w:t>successful</w:t>
+      </w:r>
+      <w:r>
+        <w:rPr>
+          <w:rFonts w:hint="default" w:ascii="Times New Roman"/>
+          <w:bCs/>
+          <w:spacing w:val="-8"/>
+          <w:highlight w:val="yellow"/>
+          <w:lang w:val="en-US"/>
+        </w:rPr>
+        <w:t>_bidder.</w:t>
+      </w:r>
+      <w:r>
+        <w:rPr>
+          <w:rFonts w:hint="default"/>
+          <w:bCs/>
+          <w:spacing w:val="-8"/>
+          <w:highlight w:val="yellow"/>
+          <w:lang w:val="en-US"/>
+        </w:rPr>
+        <w:t>phone_number</w:t>
+      </w:r>
+      <w:r>
+        <w:rPr>
+          <w:rFonts w:hint="default" w:ascii="Times New Roman"/>
+          <w:bCs/>
+          <w:spacing w:val="-8"/>
+          <w:highlight w:val="yellow"/>
+          <w:lang w:val="vi-VN"/>
+        </w:rPr>
+        <w:t>}</w:t>
+      </w:r>
+      <w:r>
+        <w:t>;</w:t>
       </w:r>
     </w:p>
     <w:p>
@@ -1368,22 +1606,74 @@
         <w:rPr>
           <w:bCs/>
         </w:rPr>
-        <w:t>+ Mã số</w:t>
-      </w:r>
-      <w:bookmarkStart w:id="3" w:name="_GoBack"/>
-      <w:bookmarkEnd w:id="3"/>
-      <w:r>
-        <w:rPr>
-          <w:bCs/>
-        </w:rPr>
-        <w:t xml:space="preserve"> thuế: </w:t>
+        <w:t xml:space="preserve">+ Mã số thuế: </w:t>
+      </w:r>
+      <w:r>
+        <w:rPr>
+          <w:rFonts w:hint="default" w:ascii="Times New Roman"/>
+          <w:bCs/>
+          <w:spacing w:val="-8"/>
+          <w:highlight w:val="yellow"/>
+          <w:lang w:val="vi-VN"/>
+        </w:rPr>
+        <w:t>{</w:t>
+      </w:r>
+      <w:r>
+        <w:rPr>
+          <w:rFonts w:hint="default" w:ascii="Times New Roman"/>
+          <w:bCs/>
+          <w:spacing w:val="-8"/>
+          <w:highlight w:val="yellow"/>
+          <w:lang w:val="en-US"/>
+        </w:rPr>
+        <w:t>TV_bid_package.</w:t>
+      </w:r>
+      <w:r>
+        <w:rPr>
+          <w:rFonts w:hint="default"/>
+          <w:bCs/>
+          <w:spacing w:val="-8"/>
+          <w:highlight w:val="yellow"/>
+          <w:lang w:val="en-US"/>
+        </w:rPr>
+        <w:t>successful</w:t>
+      </w:r>
+      <w:r>
+        <w:rPr>
+          <w:rFonts w:hint="default" w:ascii="Times New Roman"/>
+          <w:bCs/>
+          <w:spacing w:val="-8"/>
+          <w:highlight w:val="yellow"/>
+          <w:lang w:val="en-US"/>
+        </w:rPr>
+        <w:t>_bidder.</w:t>
+      </w:r>
+      <w:r>
+        <w:rPr>
+          <w:rFonts w:hint="default"/>
+          <w:bCs/>
+          <w:spacing w:val="-8"/>
+          <w:highlight w:val="yellow"/>
+          <w:lang w:val="en-US"/>
+        </w:rPr>
+        <w:t>tax_id</w:t>
+      </w:r>
+      <w:r>
+        <w:rPr>
+          <w:rFonts w:hint="default" w:ascii="Times New Roman"/>
+          <w:bCs/>
+          <w:spacing w:val="-8"/>
+          <w:highlight w:val="yellow"/>
+          <w:lang w:val="vi-VN"/>
+        </w:rPr>
+        <w:t>}</w:t>
       </w:r>
       <w:r>
         <w:rPr>
           <w:bCs/>
           <w:lang w:val="en-GB"/>
         </w:rPr>
-        <w:t>3502302306;</w:t>
+        <w:t>;</w:t>
       </w:r>
     </w:p>
     <w:p>
@@ -1402,21 +1692,66 @@
           <w:bCs/>
           <w:spacing w:val="-12"/>
         </w:rPr>
-        <w:t xml:space="preserve">+ Tài khoản: </w:t>
-      </w:r>
-      <w:r>
-        <w:rPr>
+        <w:t>+ Tài khoản:</w:t>
+      </w:r>
+      <w:bookmarkStart w:id="3" w:name="_GoBack"/>
+      <w:bookmarkEnd w:id="3"/>
+      <w:r>
+        <w:rPr>
+          <w:bCs/>
           <w:spacing w:val="-12"/>
         </w:rPr>
-        <w:t>050061161111 tại Ngân hàng Sacombank – Chi Nhánh Vũng Tàu</w:t>
-      </w:r>
-      <w:r>
-        <w:rPr>
-          <w:bCs/>
-          <w:spacing w:val="-12"/>
-          <w:lang w:val="en-GB"/>
-        </w:rPr>
-        <w:t>.</w:t>
+        <w:t xml:space="preserve"> </w:t>
+      </w:r>
+      <w:r>
+        <w:rPr>
+          <w:rFonts w:hint="default" w:ascii="Times New Roman"/>
+          <w:bCs/>
+          <w:spacing w:val="-8"/>
+          <w:highlight w:val="yellow"/>
+          <w:lang w:val="vi-VN"/>
+        </w:rPr>
+        <w:t>{</w:t>
+      </w:r>
+      <w:r>
+        <w:rPr>
+          <w:rFonts w:hint="default" w:ascii="Times New Roman"/>
+          <w:bCs/>
+          <w:spacing w:val="-8"/>
+          <w:highlight w:val="yellow"/>
+          <w:lang w:val="en-US"/>
+        </w:rPr>
+        <w:t>TV_bid_package.</w:t>
+      </w:r>
+      <w:r>
+        <w:rPr>
+          <w:rFonts w:hint="default"/>
+          <w:bCs/>
+          <w:spacing w:val="-8"/>
+          <w:highlight w:val="yellow"/>
+          <w:lang w:val="en-US"/>
+        </w:rPr>
+        <w:t>successful</w:t>
+      </w:r>
+      <w:r>
+        <w:rPr>
+          <w:rFonts w:hint="default" w:ascii="Times New Roman"/>
+          <w:bCs/>
+          <w:spacing w:val="-8"/>
+          <w:highlight w:val="yellow"/>
+          <w:lang w:val="en-US"/>
+        </w:rPr>
+        <w:t>_bidder.bank_account</w:t>
+      </w:r>
+      <w:r>
+        <w:rPr>
+          <w:rFonts w:hint="default" w:ascii="Times New Roman"/>
+          <w:bCs/>
+          <w:spacing w:val="-8"/>
+          <w:highlight w:val="yellow"/>
+          <w:lang w:val="vi-VN"/>
+        </w:rPr>
+        <w:t>}</w:t>
       </w:r>
     </w:p>
     <w:bookmarkEnd w:id="2"/>
@@ -2157,7 +2492,7 @@
     <w:lsdException w:unhideWhenUsed="0" w:uiPriority="0" w:semiHidden="0" w:name="List 3"/>
     <w:lsdException w:unhideWhenUsed="0" w:uiPriority="0" w:semiHidden="0" w:name="List 4"/>
     <w:lsdException w:unhideWhenUsed="0" w:uiPriority="0" w:semiHidden="0" w:name="List 5"/>
-    <w:lsdException w:unhideWhenUsed="0" w:uiPriority="0" w:semiHidden="0" w:name="List Bullet 2"/>
+    <w:lsdException w:qFormat="1" w:unhideWhenUsed="0" w:uiPriority="0" w:semiHidden="0" w:name="List Bullet 2"/>
     <w:lsdException w:unhideWhenUsed="0" w:uiPriority="0" w:semiHidden="0" w:name="List Bullet 3"/>
     <w:lsdException w:unhideWhenUsed="0" w:uiPriority="0" w:semiHidden="0" w:name="List Bullet 4"/>
     <w:lsdException w:unhideWhenUsed="0" w:uiPriority="0" w:semiHidden="0" w:name="List Bullet 5"/>
@@ -2206,7 +2541,7 @@
     <w:lsdException w:unhideWhenUsed="0" w:uiPriority="0" w:semiHidden="0" w:name="HTML Sample"/>
     <w:lsdException w:unhideWhenUsed="0" w:uiPriority="0" w:semiHidden="0" w:name="HTML Typewriter"/>
     <w:lsdException w:unhideWhenUsed="0" w:uiPriority="0" w:semiHidden="0" w:name="HTML Variable"/>
-    <w:lsdException w:unhideWhenUsed="0" w:uiPriority="0" w:name="Normal Table"/>
+    <w:lsdException w:qFormat="1" w:unhideWhenUsed="0" w:uiPriority="0" w:name="Normal Table"/>
     <w:lsdException w:unhideWhenUsed="0" w:uiPriority="0" w:semiHidden="0" w:name="annotation subject"/>
     <w:lsdException w:unhideWhenUsed="0" w:uiPriority="0" w:semiHidden="0" w:name="Table Simple 1"/>
     <w:lsdException w:unhideWhenUsed="0" w:uiPriority="0" w:semiHidden="0" w:name="Table Simple 2"/>
@@ -2392,6 +2727,7 @@
   <w:style w:type="table" w:default="1" w:styleId="5">
     <w:name w:val="Normal Table"/>
     <w:semiHidden/>
+    <w:qFormat/>
     <w:uiPriority w:val="0"/>
     <w:tblPr>
       <w:tblCellMar>
@@ -2480,6 +2816,7 @@
   <w:style w:type="paragraph" w:styleId="11">
     <w:name w:val="List Bullet 2"/>
     <w:basedOn w:val="1"/>
+    <w:qFormat/>
     <w:uiPriority w:val="0"/>
     <w:pPr>
       <w:numPr>

</xml_diff>

<commit_message>
shorten docx Domain fields name
</commit_message>
<xml_diff>
--- a/public/template/4. Tờ trình phê duyệt KQLCNT TV.docx
+++ b/public/template/4. Tờ trình phê duyệt KQLCNT TV.docx
@@ -1271,9 +1271,39 @@
           <w:bCs/>
           <w:spacing w:val="-8"/>
           <w:highlight w:val="yellow"/>
+          <w:lang w:val="vi-VN"/>
+        </w:rPr>
+        <w:t>TV_bp</w:t>
+      </w:r>
+      <w:r>
+        <w:rPr>
+          <w:rFonts w:hint="default" w:ascii="Times New Roman"/>
+          <w:bCs/>
+          <w:spacing w:val="-8"/>
+          <w:highlight w:val="yellow"/>
           <w:lang w:val="en-US"/>
         </w:rPr>
-        <w:t>TV_bid_package.successful_bidder.name</w:t>
+        <w:t>.</w:t>
+      </w:r>
+      <w:r>
+        <w:rPr>
+          <w:rFonts w:hint="default" w:ascii="Times New Roman"/>
+          <w:bCs/>
+          <w:spacing w:val="-8"/>
+          <w:highlight w:val="yellow"/>
+          <w:lang w:val="vi-VN"/>
+        </w:rPr>
+        <w:t>succ</w:t>
+      </w:r>
+      <w:r>
+        <w:rPr>
+          <w:rFonts w:hint="default" w:ascii="Times New Roman"/>
+          <w:bCs/>
+          <w:spacing w:val="-8"/>
+          <w:highlight w:val="yellow"/>
+          <w:lang w:val="en-US"/>
+        </w:rPr>
+        <w:t>_bidder.name</w:t>
       </w:r>
       <w:r>
         <w:rPr>
@@ -1325,9 +1355,39 @@
           <w:bCs/>
           <w:spacing w:val="-8"/>
           <w:highlight w:val="yellow"/>
+          <w:lang w:val="vi-VN"/>
+        </w:rPr>
+        <w:t>TV_bp</w:t>
+      </w:r>
+      <w:r>
+        <w:rPr>
+          <w:rFonts w:hint="default" w:ascii="Times New Roman"/>
+          <w:bCs/>
+          <w:spacing w:val="-8"/>
+          <w:highlight w:val="yellow"/>
           <w:lang w:val="en-US"/>
         </w:rPr>
-        <w:t>TV_bid_package.successful_bidder.</w:t>
+        <w:t>.</w:t>
+      </w:r>
+      <w:r>
+        <w:rPr>
+          <w:rFonts w:hint="default" w:ascii="Times New Roman"/>
+          <w:bCs/>
+          <w:spacing w:val="-8"/>
+          <w:highlight w:val="yellow"/>
+          <w:lang w:val="vi-VN"/>
+        </w:rPr>
+        <w:t>succ</w:t>
+      </w:r>
+      <w:r>
+        <w:rPr>
+          <w:rFonts w:hint="default" w:ascii="Times New Roman"/>
+          <w:bCs/>
+          <w:spacing w:val="-8"/>
+          <w:highlight w:val="yellow"/>
+          <w:lang w:val="en-US"/>
+        </w:rPr>
+        <w:t>_bidder.</w:t>
       </w:r>
       <w:r>
         <w:rPr>
@@ -1395,9 +1455,49 @@
           <w:bCs/>
           <w:spacing w:val="-8"/>
           <w:highlight w:val="yellow"/>
+          <w:lang w:val="vi-VN"/>
+        </w:rPr>
+        <w:t>TV_bp</w:t>
+      </w:r>
+      <w:r>
+        <w:rPr>
+          <w:rFonts w:hint="default" w:ascii="Times New Roman"/>
+          <w:bCs/>
+          <w:spacing w:val="-8"/>
+          <w:highlight w:val="yellow"/>
           <w:lang w:val="en-US"/>
         </w:rPr>
-        <w:t>TV_bid_package.successful_bidder.</w:t>
+        <w:t>.</w:t>
+      </w:r>
+      <w:r>
+        <w:rPr>
+          <w:rFonts w:hint="default" w:ascii="Times New Roman"/>
+          <w:bCs/>
+          <w:spacing w:val="-8"/>
+          <w:highlight w:val="yellow"/>
+          <w:lang w:val="vi-VN"/>
+        </w:rPr>
+        <w:t>succ</w:t>
+      </w:r>
+      <w:r>
+        <w:rPr>
+          <w:rFonts w:hint="default" w:ascii="Times New Roman"/>
+          <w:bCs/>
+          <w:spacing w:val="-8"/>
+          <w:highlight w:val="yellow"/>
+          <w:lang w:val="en-US"/>
+        </w:rPr>
+        <w:t>_bidder.</w:t>
+      </w:r>
+      <w:r>
+        <w:rPr>
+          <w:rFonts w:hint="default" w:ascii="Times New Roman"/>
+          <w:bCs/>
+          <w:spacing w:val="-8"/>
+          <w:highlight w:val="yellow"/>
+          <w:lang w:val="vi-VN"/>
+        </w:rPr>
+        <w:t>rep</w:t>
       </w:r>
       <w:r>
         <w:rPr>
@@ -1407,7 +1507,7 @@
           <w:highlight w:val="yellow"/>
           <w:lang w:val="en-US"/>
         </w:rPr>
-        <w:t>representative_name</w:t>
+        <w:t>_name</w:t>
       </w:r>
       <w:r>
         <w:rPr>
@@ -1462,9 +1562,49 @@
           <w:bCs/>
           <w:spacing w:val="-8"/>
           <w:highlight w:val="yellow"/>
+          <w:lang w:val="vi-VN"/>
+        </w:rPr>
+        <w:t>TV_bp</w:t>
+      </w:r>
+      <w:r>
+        <w:rPr>
+          <w:rFonts w:hint="default" w:ascii="Times New Roman"/>
+          <w:bCs/>
+          <w:spacing w:val="-8"/>
+          <w:highlight w:val="yellow"/>
           <w:lang w:val="en-US"/>
         </w:rPr>
-        <w:t>TV_bid_package.</w:t>
+        <w:t>.</w:t>
+      </w:r>
+      <w:r>
+        <w:rPr>
+          <w:rFonts w:hint="default" w:ascii="Times New Roman"/>
+          <w:bCs/>
+          <w:spacing w:val="-8"/>
+          <w:highlight w:val="yellow"/>
+          <w:lang w:val="vi-VN"/>
+        </w:rPr>
+        <w:t>succ</w:t>
+      </w:r>
+      <w:r>
+        <w:rPr>
+          <w:rFonts w:hint="default" w:ascii="Times New Roman"/>
+          <w:bCs/>
+          <w:spacing w:val="-8"/>
+          <w:highlight w:val="yellow"/>
+          <w:lang w:val="en-US"/>
+        </w:rPr>
+        <w:t>_bidder.</w:t>
+      </w:r>
+      <w:r>
+        <w:rPr>
+          <w:rFonts w:hint="default" w:ascii="Times New Roman"/>
+          <w:bCs/>
+          <w:spacing w:val="-8"/>
+          <w:highlight w:val="yellow"/>
+          <w:lang w:val="vi-VN"/>
+        </w:rPr>
+        <w:t>rep</w:t>
       </w:r>
       <w:r>
         <w:rPr>
@@ -1474,27 +1614,7 @@
           <w:highlight w:val="yellow"/>
           <w:lang w:val="en-US"/>
         </w:rPr>
-        <w:t>successful</w:t>
-      </w:r>
-      <w:r>
-        <w:rPr>
-          <w:rFonts w:hint="default" w:ascii="Times New Roman"/>
-          <w:bCs/>
-          <w:spacing w:val="-8"/>
-          <w:highlight w:val="yellow"/>
-          <w:lang w:val="en-US"/>
-        </w:rPr>
-        <w:t>_bidder.</w:t>
-      </w:r>
-      <w:r>
-        <w:rPr>
-          <w:rFonts w:hint="default"/>
-          <w:bCs/>
-          <w:spacing w:val="-8"/>
-          <w:highlight w:val="yellow"/>
-          <w:lang w:val="en-US"/>
-        </w:rPr>
-        <w:t>representative_position</w:t>
+        <w:t>_position</w:t>
       </w:r>
       <w:r>
         <w:rPr>
@@ -1545,19 +1665,41 @@
           <w:bCs/>
           <w:spacing w:val="-8"/>
           <w:highlight w:val="yellow"/>
+          <w:lang w:val="vi-VN"/>
+        </w:rPr>
+        <w:t>T</w:t>
+      </w:r>
+      <w:bookmarkStart w:id="3" w:name="_GoBack"/>
+      <w:bookmarkEnd w:id="3"/>
+      <w:r>
+        <w:rPr>
+          <w:rFonts w:hint="default" w:ascii="Times New Roman"/>
+          <w:bCs/>
+          <w:spacing w:val="-8"/>
+          <w:highlight w:val="yellow"/>
+          <w:lang w:val="vi-VN"/>
+        </w:rPr>
+        <w:t>V_bp</w:t>
+      </w:r>
+      <w:r>
+        <w:rPr>
+          <w:rFonts w:hint="default" w:ascii="Times New Roman"/>
+          <w:bCs/>
+          <w:spacing w:val="-8"/>
+          <w:highlight w:val="yellow"/>
           <w:lang w:val="en-US"/>
         </w:rPr>
-        <w:t>TV_bid_package.</w:t>
-      </w:r>
-      <w:r>
-        <w:rPr>
-          <w:rFonts w:hint="default"/>
-          <w:bCs/>
-          <w:spacing w:val="-8"/>
-          <w:highlight w:val="yellow"/>
-          <w:lang w:val="en-US"/>
-        </w:rPr>
-        <w:t>successful</w:t>
+        <w:t>.</w:t>
+      </w:r>
+      <w:r>
+        <w:rPr>
+          <w:rFonts w:hint="default" w:ascii="Times New Roman"/>
+          <w:bCs/>
+          <w:spacing w:val="-8"/>
+          <w:highlight w:val="yellow"/>
+          <w:lang w:val="vi-VN"/>
+        </w:rPr>
+        <w:t>succ</w:t>
       </w:r>
       <w:r>
         <w:rPr>
@@ -1624,19 +1766,29 @@
           <w:bCs/>
           <w:spacing w:val="-8"/>
           <w:highlight w:val="yellow"/>
+          <w:lang w:val="vi-VN"/>
+        </w:rPr>
+        <w:t>TV_bp</w:t>
+      </w:r>
+      <w:r>
+        <w:rPr>
+          <w:rFonts w:hint="default" w:ascii="Times New Roman"/>
+          <w:bCs/>
+          <w:spacing w:val="-8"/>
+          <w:highlight w:val="yellow"/>
           <w:lang w:val="en-US"/>
         </w:rPr>
-        <w:t>TV_bid_package.</w:t>
-      </w:r>
-      <w:r>
-        <w:rPr>
-          <w:rFonts w:hint="default"/>
-          <w:bCs/>
-          <w:spacing w:val="-8"/>
-          <w:highlight w:val="yellow"/>
-          <w:lang w:val="en-US"/>
-        </w:rPr>
-        <w:t>successful</w:t>
+        <w:t>.</w:t>
+      </w:r>
+      <w:r>
+        <w:rPr>
+          <w:rFonts w:hint="default" w:ascii="Times New Roman"/>
+          <w:bCs/>
+          <w:spacing w:val="-8"/>
+          <w:highlight w:val="yellow"/>
+          <w:lang w:val="vi-VN"/>
+        </w:rPr>
+        <w:t>succ</w:t>
       </w:r>
       <w:r>
         <w:rPr>
@@ -1692,16 +1844,7 @@
           <w:bCs/>
           <w:spacing w:val="-12"/>
         </w:rPr>
-        <w:t>+ Tài khoản:</w:t>
-      </w:r>
-      <w:bookmarkStart w:id="3" w:name="_GoBack"/>
-      <w:bookmarkEnd w:id="3"/>
-      <w:r>
-        <w:rPr>
-          <w:bCs/>
-          <w:spacing w:val="-12"/>
-        </w:rPr>
-        <w:t xml:space="preserve"> </w:t>
+        <w:t xml:space="preserve">+ Tài khoản: </w:t>
       </w:r>
       <w:r>
         <w:rPr>
@@ -1719,19 +1862,29 @@
           <w:bCs/>
           <w:spacing w:val="-8"/>
           <w:highlight w:val="yellow"/>
+          <w:lang w:val="vi-VN"/>
+        </w:rPr>
+        <w:t>TV_bp</w:t>
+      </w:r>
+      <w:r>
+        <w:rPr>
+          <w:rFonts w:hint="default" w:ascii="Times New Roman"/>
+          <w:bCs/>
+          <w:spacing w:val="-8"/>
+          <w:highlight w:val="yellow"/>
           <w:lang w:val="en-US"/>
         </w:rPr>
-        <w:t>TV_bid_package.</w:t>
-      </w:r>
-      <w:r>
-        <w:rPr>
-          <w:rFonts w:hint="default"/>
-          <w:bCs/>
-          <w:spacing w:val="-8"/>
-          <w:highlight w:val="yellow"/>
-          <w:lang w:val="en-US"/>
-        </w:rPr>
-        <w:t>successful</w:t>
+        <w:t>.</w:t>
+      </w:r>
+      <w:r>
+        <w:rPr>
+          <w:rFonts w:hint="default" w:ascii="Times New Roman"/>
+          <w:bCs/>
+          <w:spacing w:val="-8"/>
+          <w:highlight w:val="yellow"/>
+          <w:lang w:val="vi-VN"/>
+        </w:rPr>
+        <w:t>succ</w:t>
       </w:r>
       <w:r>
         <w:rPr>

</xml_diff>